<commit_message>
kubernetes - objects - metadata added
</commit_message>
<xml_diff>
--- a/Kubernetes/concepts/4-kubectl/4-kubectl.docx
+++ b/Kubernetes/concepts/4-kubectl/4-kubectl.docx
@@ -379,20 +379,7 @@
           <w:sz w:val="28"/>
           <w:szCs w:val="28"/>
         </w:rPr>
-        <w:t>~</w:t>
-      </w:r>
-      <w:proofErr w:type="gramStart"/>
-      <w:r>
-        <w:rPr>
-          <w:rFonts w:asciiTheme="majorBidi" w:hAnsiTheme="majorBidi" w:cstheme="majorBidi"/>
-          <w:b/>
-          <w:bCs/>
-          <w:i/>
-          <w:iCs/>
-          <w:sz w:val="28"/>
-          <w:szCs w:val="28"/>
-        </w:rPr>
-        <w:t>/.</w:t>
+        <w:t>~/.</w:t>
       </w:r>
       <w:proofErr w:type="spellStart"/>
       <w:r>
@@ -408,7 +395,6 @@
         <w:t>kube</w:t>
       </w:r>
       <w:proofErr w:type="spellEnd"/>
-      <w:proofErr w:type="gramEnd"/>
       <w:r>
         <w:rPr>
           <w:rFonts w:asciiTheme="majorBidi" w:hAnsiTheme="majorBidi" w:cstheme="majorBidi"/>
@@ -1705,20 +1691,7 @@
           <w:sz w:val="28"/>
           <w:szCs w:val="28"/>
         </w:rPr>
-        <w:t>~</w:t>
-      </w:r>
-      <w:proofErr w:type="gramStart"/>
-      <w:r>
-        <w:rPr>
-          <w:rFonts w:asciiTheme="majorBidi" w:hAnsiTheme="majorBidi" w:cstheme="majorBidi"/>
-          <w:b/>
-          <w:bCs/>
-          <w:i/>
-          <w:iCs/>
-          <w:sz w:val="28"/>
-          <w:szCs w:val="28"/>
-        </w:rPr>
-        <w:t>/.</w:t>
+        <w:t>~/.</w:t>
       </w:r>
       <w:proofErr w:type="spellStart"/>
       <w:r>
@@ -1734,7 +1707,6 @@
         <w:t>kube</w:t>
       </w:r>
       <w:proofErr w:type="spellEnd"/>
-      <w:proofErr w:type="gramEnd"/>
       <w:r>
         <w:rPr>
           <w:rFonts w:asciiTheme="majorBidi" w:hAnsiTheme="majorBidi" w:cstheme="majorBidi"/>
@@ -3790,7 +3762,6 @@
         </w:rPr>
         <w:t xml:space="preserve">→ </w:t>
       </w:r>
-      <w:proofErr w:type="gramStart"/>
       <w:r>
         <w:rPr>
           <w:rFonts w:asciiTheme="majorBidi" w:hAnsiTheme="majorBidi" w:cstheme="majorBidi"/>
@@ -3805,16 +3776,7 @@
           <w:sz w:val="28"/>
           <w:szCs w:val="28"/>
         </w:rPr>
-        <w:t xml:space="preserve"> is</w:t>
-      </w:r>
-      <w:proofErr w:type="gramEnd"/>
-      <w:r>
-        <w:rPr>
-          <w:rFonts w:asciiTheme="majorBidi" w:hAnsiTheme="majorBidi" w:cstheme="majorBidi"/>
-          <w:sz w:val="28"/>
-          <w:szCs w:val="28"/>
-        </w:rPr>
-        <w:t xml:space="preserve"> a command used to display the resource types supported by the Kubernetes API server in the current cluster. It lists all available Kubernetes resources along with information such as their short names, API group, whether they are </w:t>
+        <w:t xml:space="preserve"> is a command used to display the resource types supported by the Kubernetes API server in the current cluster. It lists all available Kubernetes resources along with information such as their short names, API group, whether they are </w:t>
       </w:r>
       <w:proofErr w:type="spellStart"/>
       <w:r>
@@ -7709,7 +7671,6 @@
         <w:t xml:space="preserve"> explain </w:t>
       </w:r>
       <w:proofErr w:type="spellStart"/>
-      <w:proofErr w:type="gramStart"/>
       <w:r>
         <w:rPr>
           <w:rFonts w:asciiTheme="majorBidi" w:hAnsiTheme="majorBidi" w:cstheme="majorBidi"/>
@@ -7723,7 +7684,6 @@
         <w:t>pod.spec</w:t>
       </w:r>
       <w:proofErr w:type="spellEnd"/>
-      <w:proofErr w:type="gramEnd"/>
       <w:r>
         <w:rPr>
           <w:rFonts w:asciiTheme="majorBidi" w:hAnsiTheme="majorBidi" w:cstheme="majorBidi"/>
@@ -7800,31 +7760,17 @@
         <w:t xml:space="preserve"> explain </w:t>
       </w:r>
       <w:proofErr w:type="spellStart"/>
-      <w:proofErr w:type="gramStart"/>
-      <w:r>
-        <w:rPr>
-          <w:rFonts w:asciiTheme="majorBidi" w:hAnsiTheme="majorBidi" w:cstheme="majorBidi"/>
-          <w:b/>
-          <w:bCs/>
-          <w:i/>
-          <w:iCs/>
-          <w:sz w:val="28"/>
-          <w:szCs w:val="28"/>
-        </w:rPr>
-        <w:t>pod.spec</w:t>
-      </w:r>
-      <w:proofErr w:type="gramEnd"/>
-      <w:r>
-        <w:rPr>
-          <w:rFonts w:asciiTheme="majorBidi" w:hAnsiTheme="majorBidi" w:cstheme="majorBidi"/>
-          <w:b/>
-          <w:bCs/>
-          <w:i/>
-          <w:iCs/>
-          <w:sz w:val="28"/>
-          <w:szCs w:val="28"/>
-        </w:rPr>
-        <w:t>.containers</w:t>
+      <w:r>
+        <w:rPr>
+          <w:rFonts w:asciiTheme="majorBidi" w:hAnsiTheme="majorBidi" w:cstheme="majorBidi"/>
+          <w:b/>
+          <w:bCs/>
+          <w:i/>
+          <w:iCs/>
+          <w:sz w:val="28"/>
+          <w:szCs w:val="28"/>
+        </w:rPr>
+        <w:t>pod.spec.containers</w:t>
       </w:r>
       <w:proofErr w:type="spellEnd"/>
       <w:r>
@@ -8604,7 +8550,6 @@
         <w:t xml:space="preserve"> create -f </w:t>
       </w:r>
       <w:proofErr w:type="spellStart"/>
-      <w:proofErr w:type="gramStart"/>
       <w:r>
         <w:rPr>
           <w:rFonts w:asciiTheme="majorBidi" w:hAnsiTheme="majorBidi" w:cstheme="majorBidi"/>
@@ -8618,7 +8563,6 @@
         <w:t>pod.yaml</w:t>
       </w:r>
       <w:proofErr w:type="spellEnd"/>
-      <w:proofErr w:type="gramEnd"/>
       <w:r>
         <w:rPr>
           <w:rFonts w:asciiTheme="majorBidi" w:hAnsiTheme="majorBidi" w:cstheme="majorBidi"/>
@@ -8636,7 +8580,6 @@
         <w:t xml:space="preserve">This command creates the Pod defined in the </w:t>
       </w:r>
       <w:proofErr w:type="spellStart"/>
-      <w:proofErr w:type="gramStart"/>
       <w:r>
         <w:rPr>
           <w:rFonts w:asciiTheme="majorBidi" w:hAnsiTheme="majorBidi" w:cstheme="majorBidi"/>
@@ -8646,7 +8589,6 @@
         <w:t>pod.yaml</w:t>
       </w:r>
       <w:proofErr w:type="spellEnd"/>
-      <w:proofErr w:type="gramEnd"/>
       <w:r>
         <w:rPr>
           <w:rFonts w:asciiTheme="majorBidi" w:hAnsiTheme="majorBidi" w:cstheme="majorBidi"/>
@@ -8875,7 +8817,6 @@
         <w:t xml:space="preserve"> app-config --from-file=</w:t>
       </w:r>
       <w:proofErr w:type="spellStart"/>
-      <w:proofErr w:type="gramStart"/>
       <w:r>
         <w:rPr>
           <w:rFonts w:asciiTheme="majorBidi" w:hAnsiTheme="majorBidi" w:cstheme="majorBidi"/>
@@ -8897,7 +8838,6 @@
         <w:t>properties</w:t>
       </w:r>
       <w:proofErr w:type="spellEnd"/>
-      <w:proofErr w:type="gramEnd"/>
       <w:r>
         <w:rPr>
           <w:rFonts w:asciiTheme="majorBidi" w:hAnsiTheme="majorBidi" w:cstheme="majorBidi"/>
@@ -9423,7 +9363,6 @@
         <w:t xml:space="preserve"> apply -f </w:t>
       </w:r>
       <w:proofErr w:type="spellStart"/>
-      <w:proofErr w:type="gramStart"/>
       <w:r>
         <w:rPr>
           <w:rFonts w:asciiTheme="majorBidi" w:hAnsiTheme="majorBidi" w:cstheme="majorBidi"/>
@@ -9437,7 +9376,6 @@
         <w:t>pod.yaml</w:t>
       </w:r>
       <w:proofErr w:type="spellEnd"/>
-      <w:proofErr w:type="gramEnd"/>
       <w:r>
         <w:rPr>
           <w:rFonts w:asciiTheme="majorBidi" w:hAnsiTheme="majorBidi" w:cstheme="majorBidi"/>
@@ -10566,6 +10504,939 @@
     </w:p>
     <w:p>
       <w:pPr>
+        <w:spacing w:after="100"/>
+        <w:jc w:val="both"/>
+        <w:rPr>
+          <w:rFonts w:asciiTheme="majorBidi" w:hAnsiTheme="majorBidi" w:cstheme="majorBidi"/>
+          <w:sz w:val="28"/>
+          <w:szCs w:val="28"/>
+        </w:rPr>
+      </w:pPr>
+    </w:p>
+    <w:p>
+      <w:pPr>
+        <w:spacing w:after="100"/>
+        <w:jc w:val="both"/>
+        <w:rPr>
+          <w:rFonts w:asciiTheme="majorBidi" w:hAnsiTheme="majorBidi" w:cstheme="majorBidi"/>
+          <w:sz w:val="28"/>
+          <w:szCs w:val="28"/>
+        </w:rPr>
+      </w:pPr>
+    </w:p>
+    <w:p>
+      <w:pPr>
+        <w:spacing w:after="100"/>
+        <w:jc w:val="both"/>
+        <w:rPr>
+          <w:rFonts w:asciiTheme="majorBidi" w:hAnsiTheme="majorBidi" w:cstheme="majorBidi"/>
+          <w:sz w:val="28"/>
+          <w:szCs w:val="28"/>
+        </w:rPr>
+      </w:pPr>
+    </w:p>
+    <w:p>
+      <w:pPr>
+        <w:spacing w:after="100"/>
+        <w:rPr>
+          <w:rFonts w:asciiTheme="majorBidi" w:hAnsiTheme="majorBidi" w:cstheme="majorBidi"/>
+          <w:sz w:val="28"/>
+          <w:szCs w:val="28"/>
+        </w:rPr>
+      </w:pPr>
+      <w:proofErr w:type="spellStart"/>
+      <w:r>
+        <w:rPr>
+          <w:rFonts w:asciiTheme="majorBidi" w:hAnsiTheme="majorBidi" w:cstheme="majorBidi"/>
+          <w:sz w:val="28"/>
+          <w:szCs w:val="28"/>
+        </w:rPr>
+        <w:t>kubectl</w:t>
+      </w:r>
+      <w:proofErr w:type="spellEnd"/>
+      <w:r>
+        <w:rPr>
+          <w:rFonts w:asciiTheme="majorBidi" w:hAnsiTheme="majorBidi" w:cstheme="majorBidi"/>
+          <w:sz w:val="28"/>
+          <w:szCs w:val="28"/>
+        </w:rPr>
+        <w:t xml:space="preserve"> patch</w:t>
+      </w:r>
+    </w:p>
+    <w:p>
+      <w:pPr>
+        <w:spacing w:after="100"/>
+        <w:rPr>
+          <w:rFonts w:asciiTheme="majorBidi" w:hAnsiTheme="majorBidi" w:cstheme="majorBidi"/>
+          <w:sz w:val="28"/>
+          <w:szCs w:val="28"/>
+        </w:rPr>
+      </w:pPr>
+    </w:p>
+    <w:p>
+      <w:pPr>
+        <w:spacing w:after="100"/>
+        <w:rPr>
+          <w:rFonts w:asciiTheme="majorBidi" w:hAnsiTheme="majorBidi" w:cstheme="majorBidi"/>
+          <w:sz w:val="28"/>
+          <w:szCs w:val="28"/>
+        </w:rPr>
+      </w:pPr>
+      <w:proofErr w:type="spellStart"/>
+      <w:r>
+        <w:rPr>
+          <w:rFonts w:asciiTheme="majorBidi" w:hAnsiTheme="majorBidi" w:cstheme="majorBidi"/>
+          <w:sz w:val="28"/>
+          <w:szCs w:val="28"/>
+        </w:rPr>
+        <w:t>kubectl</w:t>
+      </w:r>
+      <w:proofErr w:type="spellEnd"/>
+      <w:r>
+        <w:rPr>
+          <w:rFonts w:asciiTheme="majorBidi" w:hAnsiTheme="majorBidi" w:cstheme="majorBidi"/>
+          <w:sz w:val="28"/>
+          <w:szCs w:val="28"/>
+        </w:rPr>
+        <w:t xml:space="preserve"> patch modifies specific fields of an existing Kubernetes object without replacing the entire object.</w:t>
+      </w:r>
+    </w:p>
+    <w:p>
+      <w:pPr>
+        <w:spacing w:after="100"/>
+        <w:rPr>
+          <w:rFonts w:asciiTheme="majorBidi" w:hAnsiTheme="majorBidi" w:cstheme="majorBidi"/>
+          <w:sz w:val="28"/>
+          <w:szCs w:val="28"/>
+        </w:rPr>
+      </w:pPr>
+    </w:p>
+    <w:p>
+      <w:pPr>
+        <w:spacing w:after="100"/>
+        <w:rPr>
+          <w:rFonts w:asciiTheme="majorBidi" w:hAnsiTheme="majorBidi" w:cstheme="majorBidi"/>
+          <w:sz w:val="28"/>
+          <w:szCs w:val="28"/>
+        </w:rPr>
+      </w:pPr>
+      <w:r>
+        <w:rPr>
+          <w:rFonts w:asciiTheme="majorBidi" w:hAnsiTheme="majorBidi" w:cstheme="majorBidi"/>
+          <w:sz w:val="28"/>
+          <w:szCs w:val="28"/>
+        </w:rPr>
+        <w:t>The general syntax is:</w:t>
+      </w:r>
+    </w:p>
+    <w:p>
+      <w:pPr>
+        <w:spacing w:after="100"/>
+        <w:rPr>
+          <w:rFonts w:asciiTheme="majorBidi" w:hAnsiTheme="majorBidi" w:cstheme="majorBidi"/>
+          <w:sz w:val="28"/>
+          <w:szCs w:val="28"/>
+        </w:rPr>
+      </w:pPr>
+    </w:p>
+    <w:p>
+      <w:pPr>
+        <w:spacing w:after="100"/>
+        <w:rPr>
+          <w:rFonts w:asciiTheme="majorBidi" w:hAnsiTheme="majorBidi" w:cstheme="majorBidi"/>
+          <w:sz w:val="28"/>
+          <w:szCs w:val="28"/>
+        </w:rPr>
+      </w:pPr>
+      <w:proofErr w:type="spellStart"/>
+      <w:r>
+        <w:rPr>
+          <w:rFonts w:asciiTheme="majorBidi" w:hAnsiTheme="majorBidi" w:cstheme="majorBidi"/>
+          <w:sz w:val="28"/>
+          <w:szCs w:val="28"/>
+        </w:rPr>
+        <w:lastRenderedPageBreak/>
+        <w:t>kubectl</w:t>
+      </w:r>
+      <w:proofErr w:type="spellEnd"/>
+      <w:r>
+        <w:rPr>
+          <w:rFonts w:asciiTheme="majorBidi" w:hAnsiTheme="majorBidi" w:cstheme="majorBidi"/>
+          <w:sz w:val="28"/>
+          <w:szCs w:val="28"/>
+        </w:rPr>
+        <w:t xml:space="preserve"> patch &lt;resource&gt; &lt;name&gt; --type=&lt;patch-type&gt; -p='&lt;patch-data&gt;'</w:t>
+      </w:r>
+    </w:p>
+    <w:p>
+      <w:pPr>
+        <w:spacing w:after="100"/>
+        <w:rPr>
+          <w:rFonts w:asciiTheme="majorBidi" w:hAnsiTheme="majorBidi" w:cstheme="majorBidi"/>
+          <w:sz w:val="28"/>
+          <w:szCs w:val="28"/>
+        </w:rPr>
+      </w:pPr>
+    </w:p>
+    <w:p>
+      <w:pPr>
+        <w:spacing w:after="100"/>
+        <w:rPr>
+          <w:rFonts w:asciiTheme="majorBidi" w:hAnsiTheme="majorBidi" w:cstheme="majorBidi"/>
+          <w:sz w:val="28"/>
+          <w:szCs w:val="28"/>
+        </w:rPr>
+      </w:pPr>
+      <w:r>
+        <w:rPr>
+          <w:rFonts w:asciiTheme="majorBidi" w:hAnsiTheme="majorBidi" w:cstheme="majorBidi"/>
+          <w:sz w:val="28"/>
+          <w:szCs w:val="28"/>
+        </w:rPr>
+        <w:t>The three commonly relevant patch types are:</w:t>
+      </w:r>
+    </w:p>
+    <w:p>
+      <w:pPr>
+        <w:spacing w:after="100"/>
+        <w:rPr>
+          <w:rFonts w:asciiTheme="majorBidi" w:hAnsiTheme="majorBidi" w:cstheme="majorBidi"/>
+          <w:sz w:val="28"/>
+          <w:szCs w:val="28"/>
+        </w:rPr>
+      </w:pPr>
+    </w:p>
+    <w:p>
+      <w:pPr>
+        <w:spacing w:after="100"/>
+        <w:rPr>
+          <w:rFonts w:asciiTheme="majorBidi" w:hAnsiTheme="majorBidi" w:cstheme="majorBidi"/>
+          <w:sz w:val="28"/>
+          <w:szCs w:val="28"/>
+        </w:rPr>
+      </w:pPr>
+      <w:r>
+        <w:rPr>
+          <w:rFonts w:asciiTheme="majorBidi" w:hAnsiTheme="majorBidi" w:cstheme="majorBidi"/>
+          <w:sz w:val="28"/>
+          <w:szCs w:val="28"/>
+        </w:rPr>
+        <w:t>Strategic Merge Patch → Kubernetes-specific merge behavior for supported built-in resources.</w:t>
+      </w:r>
+    </w:p>
+    <w:p>
+      <w:pPr>
+        <w:spacing w:after="100"/>
+        <w:rPr>
+          <w:rFonts w:asciiTheme="majorBidi" w:hAnsiTheme="majorBidi" w:cstheme="majorBidi"/>
+          <w:sz w:val="28"/>
+          <w:szCs w:val="28"/>
+        </w:rPr>
+      </w:pPr>
+      <w:r>
+        <w:rPr>
+          <w:rFonts w:asciiTheme="majorBidi" w:hAnsiTheme="majorBidi" w:cstheme="majorBidi"/>
+          <w:sz w:val="28"/>
+          <w:szCs w:val="28"/>
+        </w:rPr>
+        <w:t>JSON Merge Patch → merges a JSON object into the existing resource.</w:t>
+      </w:r>
+    </w:p>
+    <w:p>
+      <w:pPr>
+        <w:spacing w:after="100"/>
+        <w:rPr>
+          <w:rFonts w:asciiTheme="majorBidi" w:hAnsiTheme="majorBidi" w:cstheme="majorBidi"/>
+          <w:sz w:val="28"/>
+          <w:szCs w:val="28"/>
+        </w:rPr>
+      </w:pPr>
+      <w:r>
+        <w:rPr>
+          <w:rFonts w:asciiTheme="majorBidi" w:hAnsiTheme="majorBidi" w:cstheme="majorBidi"/>
+          <w:sz w:val="28"/>
+          <w:szCs w:val="28"/>
+        </w:rPr>
+        <w:t>JSON Patch → performs explicit operations such as add, remove, and replace on specific fields.</w:t>
+      </w:r>
+    </w:p>
+    <w:p>
+      <w:pPr>
+        <w:spacing w:after="100"/>
+        <w:rPr>
+          <w:rFonts w:asciiTheme="majorBidi" w:hAnsiTheme="majorBidi" w:cstheme="majorBidi"/>
+          <w:sz w:val="28"/>
+          <w:szCs w:val="28"/>
+        </w:rPr>
+      </w:pPr>
+    </w:p>
+    <w:p>
+      <w:pPr>
+        <w:spacing w:after="100"/>
+        <w:rPr>
+          <w:rFonts w:asciiTheme="majorBidi" w:hAnsiTheme="majorBidi" w:cstheme="majorBidi"/>
+          <w:sz w:val="28"/>
+          <w:szCs w:val="28"/>
+        </w:rPr>
+      </w:pPr>
+      <w:r>
+        <w:rPr>
+          <w:rFonts w:asciiTheme="majorBidi" w:hAnsiTheme="majorBidi" w:cstheme="majorBidi"/>
+          <w:sz w:val="28"/>
+          <w:szCs w:val="28"/>
+        </w:rPr>
+        <w:t>For example, to change the number of replicas of a Deployment:</w:t>
+      </w:r>
+    </w:p>
+    <w:p>
+      <w:pPr>
+        <w:spacing w:after="100"/>
+        <w:rPr>
+          <w:rFonts w:asciiTheme="majorBidi" w:hAnsiTheme="majorBidi" w:cstheme="majorBidi"/>
+          <w:sz w:val="28"/>
+          <w:szCs w:val="28"/>
+        </w:rPr>
+      </w:pPr>
+    </w:p>
+    <w:p>
+      <w:pPr>
+        <w:spacing w:after="100"/>
+        <w:rPr>
+          <w:rFonts w:asciiTheme="majorBidi" w:hAnsiTheme="majorBidi" w:cstheme="majorBidi"/>
+          <w:sz w:val="28"/>
+          <w:szCs w:val="28"/>
+        </w:rPr>
+      </w:pPr>
+      <w:proofErr w:type="spellStart"/>
+      <w:r>
+        <w:rPr>
+          <w:rFonts w:asciiTheme="majorBidi" w:hAnsiTheme="majorBidi" w:cstheme="majorBidi"/>
+          <w:sz w:val="28"/>
+          <w:szCs w:val="28"/>
+        </w:rPr>
+        <w:t>kubectl</w:t>
+      </w:r>
+      <w:proofErr w:type="spellEnd"/>
+      <w:r>
+        <w:rPr>
+          <w:rFonts w:asciiTheme="majorBidi" w:hAnsiTheme="majorBidi" w:cstheme="majorBidi"/>
+          <w:sz w:val="28"/>
+          <w:szCs w:val="28"/>
+        </w:rPr>
+        <w:t xml:space="preserve"> patch deployment nginx \</w:t>
+      </w:r>
+    </w:p>
+    <w:p>
+      <w:pPr>
+        <w:spacing w:after="100"/>
+        <w:rPr>
+          <w:rFonts w:asciiTheme="majorBidi" w:hAnsiTheme="majorBidi" w:cstheme="majorBidi"/>
+          <w:sz w:val="28"/>
+          <w:szCs w:val="28"/>
+        </w:rPr>
+      </w:pPr>
+      <w:r>
+        <w:rPr>
+          <w:rFonts w:asciiTheme="majorBidi" w:hAnsiTheme="majorBidi" w:cstheme="majorBidi"/>
+          <w:sz w:val="28"/>
+          <w:szCs w:val="28"/>
+        </w:rPr>
+        <w:t xml:space="preserve">  -p '{"spec":{"replicas":3}}'</w:t>
+      </w:r>
+    </w:p>
+    <w:p>
+      <w:pPr>
+        <w:spacing w:after="100"/>
+        <w:rPr>
+          <w:rFonts w:asciiTheme="majorBidi" w:hAnsiTheme="majorBidi" w:cstheme="majorBidi"/>
+          <w:sz w:val="28"/>
+          <w:szCs w:val="28"/>
+        </w:rPr>
+      </w:pPr>
+    </w:p>
+    <w:p>
+      <w:pPr>
+        <w:spacing w:after="100"/>
+        <w:rPr>
+          <w:rFonts w:asciiTheme="majorBidi" w:hAnsiTheme="majorBidi" w:cstheme="majorBidi"/>
+          <w:sz w:val="28"/>
+          <w:szCs w:val="28"/>
+        </w:rPr>
+      </w:pPr>
+      <w:r>
+        <w:rPr>
+          <w:rFonts w:asciiTheme="majorBidi" w:hAnsiTheme="majorBidi" w:cstheme="majorBidi"/>
+          <w:sz w:val="28"/>
+          <w:szCs w:val="28"/>
+        </w:rPr>
+        <w:t xml:space="preserve">This modifies only </w:t>
+      </w:r>
+      <w:proofErr w:type="spellStart"/>
+      <w:r>
+        <w:rPr>
+          <w:rFonts w:asciiTheme="majorBidi" w:hAnsiTheme="majorBidi" w:cstheme="majorBidi"/>
+          <w:sz w:val="28"/>
+          <w:szCs w:val="28"/>
+        </w:rPr>
+        <w:t>spec.replicas</w:t>
+      </w:r>
+      <w:proofErr w:type="spellEnd"/>
+      <w:r>
+        <w:rPr>
+          <w:rFonts w:asciiTheme="majorBidi" w:hAnsiTheme="majorBidi" w:cstheme="majorBidi"/>
+          <w:sz w:val="28"/>
+          <w:szCs w:val="28"/>
+        </w:rPr>
+        <w:t>; the rest of the Deployment remains unchanged.</w:t>
+      </w:r>
+    </w:p>
+    <w:p>
+      <w:pPr>
+        <w:spacing w:after="100"/>
+        <w:rPr>
+          <w:rFonts w:asciiTheme="majorBidi" w:hAnsiTheme="majorBidi" w:cstheme="majorBidi"/>
+          <w:sz w:val="28"/>
+          <w:szCs w:val="28"/>
+        </w:rPr>
+      </w:pPr>
+    </w:p>
+    <w:p>
+      <w:pPr>
+        <w:spacing w:after="100"/>
+        <w:rPr>
+          <w:rFonts w:asciiTheme="majorBidi" w:hAnsiTheme="majorBidi" w:cstheme="majorBidi"/>
+          <w:sz w:val="28"/>
+          <w:szCs w:val="28"/>
+        </w:rPr>
+      </w:pPr>
+      <w:r>
+        <w:rPr>
+          <w:rFonts w:asciiTheme="majorBidi" w:hAnsiTheme="majorBidi" w:cstheme="majorBidi"/>
+          <w:sz w:val="28"/>
+          <w:szCs w:val="28"/>
+        </w:rPr>
+        <w:t>For more precise modifications, JSON Patch can be used:</w:t>
+      </w:r>
+    </w:p>
+    <w:p>
+      <w:pPr>
+        <w:spacing w:after="100"/>
+        <w:rPr>
+          <w:rFonts w:asciiTheme="majorBidi" w:hAnsiTheme="majorBidi" w:cstheme="majorBidi"/>
+          <w:sz w:val="28"/>
+          <w:szCs w:val="28"/>
+        </w:rPr>
+      </w:pPr>
+    </w:p>
+    <w:p>
+      <w:pPr>
+        <w:spacing w:after="100"/>
+        <w:rPr>
+          <w:rFonts w:asciiTheme="majorBidi" w:hAnsiTheme="majorBidi" w:cstheme="majorBidi"/>
+          <w:sz w:val="28"/>
+          <w:szCs w:val="28"/>
+        </w:rPr>
+      </w:pPr>
+      <w:proofErr w:type="spellStart"/>
+      <w:r>
+        <w:rPr>
+          <w:rFonts w:asciiTheme="majorBidi" w:hAnsiTheme="majorBidi" w:cstheme="majorBidi"/>
+          <w:sz w:val="28"/>
+          <w:szCs w:val="28"/>
+        </w:rPr>
+        <w:t>kubectl</w:t>
+      </w:r>
+      <w:proofErr w:type="spellEnd"/>
+      <w:r>
+        <w:rPr>
+          <w:rFonts w:asciiTheme="majorBidi" w:hAnsiTheme="majorBidi" w:cstheme="majorBidi"/>
+          <w:sz w:val="28"/>
+          <w:szCs w:val="28"/>
+        </w:rPr>
+        <w:t xml:space="preserve"> patch deployment nginx \</w:t>
+      </w:r>
+    </w:p>
+    <w:p>
+      <w:pPr>
+        <w:spacing w:after="100"/>
+        <w:rPr>
+          <w:rFonts w:asciiTheme="majorBidi" w:hAnsiTheme="majorBidi" w:cstheme="majorBidi"/>
+          <w:sz w:val="28"/>
+          <w:szCs w:val="28"/>
+        </w:rPr>
+      </w:pPr>
+      <w:r>
+        <w:rPr>
+          <w:rFonts w:asciiTheme="majorBidi" w:hAnsiTheme="majorBidi" w:cstheme="majorBidi"/>
+          <w:sz w:val="28"/>
+          <w:szCs w:val="28"/>
+        </w:rPr>
+        <w:t xml:space="preserve">  --type=</w:t>
+      </w:r>
+      <w:proofErr w:type="spellStart"/>
+      <w:r>
+        <w:rPr>
+          <w:rFonts w:asciiTheme="majorBidi" w:hAnsiTheme="majorBidi" w:cstheme="majorBidi"/>
+          <w:sz w:val="28"/>
+          <w:szCs w:val="28"/>
+        </w:rPr>
+        <w:t>json</w:t>
+      </w:r>
+      <w:proofErr w:type="spellEnd"/>
+      <w:r>
+        <w:rPr>
+          <w:rFonts w:asciiTheme="majorBidi" w:hAnsiTheme="majorBidi" w:cstheme="majorBidi"/>
+          <w:sz w:val="28"/>
+          <w:szCs w:val="28"/>
+        </w:rPr>
+        <w:t xml:space="preserve"> \</w:t>
+      </w:r>
+    </w:p>
+    <w:p>
+      <w:pPr>
+        <w:spacing w:after="100"/>
+        <w:rPr>
+          <w:rFonts w:asciiTheme="majorBidi" w:hAnsiTheme="majorBidi" w:cstheme="majorBidi"/>
+          <w:sz w:val="28"/>
+          <w:szCs w:val="28"/>
+        </w:rPr>
+      </w:pPr>
+      <w:r>
+        <w:rPr>
+          <w:rFonts w:asciiTheme="majorBidi" w:hAnsiTheme="majorBidi" w:cstheme="majorBidi"/>
+          <w:sz w:val="28"/>
+          <w:szCs w:val="28"/>
+        </w:rPr>
+        <w:t xml:space="preserve">  -p='[{"</w:t>
+      </w:r>
+      <w:proofErr w:type="spellStart"/>
+      <w:r>
+        <w:rPr>
+          <w:rFonts w:asciiTheme="majorBidi" w:hAnsiTheme="majorBidi" w:cstheme="majorBidi"/>
+          <w:sz w:val="28"/>
+          <w:szCs w:val="28"/>
+        </w:rPr>
+        <w:t>op":"replace","path</w:t>
+      </w:r>
+      <w:proofErr w:type="spellEnd"/>
+      <w:r>
+        <w:rPr>
+          <w:rFonts w:asciiTheme="majorBidi" w:hAnsiTheme="majorBidi" w:cstheme="majorBidi"/>
+          <w:sz w:val="28"/>
+          <w:szCs w:val="28"/>
+        </w:rPr>
+        <w:t>":"/spec/replicas","value":3}]'</w:t>
+      </w:r>
+    </w:p>
+    <w:p>
+      <w:pPr>
+        <w:spacing w:after="100"/>
+        <w:rPr>
+          <w:rFonts w:asciiTheme="majorBidi" w:hAnsiTheme="majorBidi" w:cstheme="majorBidi"/>
+          <w:sz w:val="28"/>
+          <w:szCs w:val="28"/>
+        </w:rPr>
+      </w:pPr>
+    </w:p>
+    <w:p>
+      <w:pPr>
+        <w:spacing w:after="100"/>
+        <w:rPr>
+          <w:rFonts w:asciiTheme="majorBidi" w:hAnsiTheme="majorBidi" w:cstheme="majorBidi"/>
+          <w:sz w:val="28"/>
+          <w:szCs w:val="28"/>
+        </w:rPr>
+      </w:pPr>
+      <w:r>
+        <w:rPr>
+          <w:rFonts w:asciiTheme="majorBidi" w:hAnsiTheme="majorBidi" w:cstheme="majorBidi"/>
+          <w:sz w:val="28"/>
+          <w:szCs w:val="28"/>
+        </w:rPr>
+        <w:t>JSON Patch is particularly useful when you need to explicitly manipulate a specific field, such as removing a finalizer:</w:t>
+      </w:r>
+    </w:p>
+    <w:p>
+      <w:pPr>
+        <w:spacing w:after="100"/>
+        <w:rPr>
+          <w:rFonts w:asciiTheme="majorBidi" w:hAnsiTheme="majorBidi" w:cstheme="majorBidi"/>
+          <w:sz w:val="28"/>
+          <w:szCs w:val="28"/>
+        </w:rPr>
+      </w:pPr>
+    </w:p>
+    <w:p>
+      <w:pPr>
+        <w:spacing w:after="100"/>
+        <w:rPr>
+          <w:rFonts w:asciiTheme="majorBidi" w:hAnsiTheme="majorBidi" w:cstheme="majorBidi"/>
+          <w:sz w:val="28"/>
+          <w:szCs w:val="28"/>
+        </w:rPr>
+      </w:pPr>
+      <w:proofErr w:type="spellStart"/>
+      <w:r>
+        <w:rPr>
+          <w:rFonts w:asciiTheme="majorBidi" w:hAnsiTheme="majorBidi" w:cstheme="majorBidi"/>
+          <w:sz w:val="28"/>
+          <w:szCs w:val="28"/>
+        </w:rPr>
+        <w:t>kubectl</w:t>
+      </w:r>
+      <w:proofErr w:type="spellEnd"/>
+      <w:r>
+        <w:rPr>
+          <w:rFonts w:asciiTheme="majorBidi" w:hAnsiTheme="majorBidi" w:cstheme="majorBidi"/>
+          <w:sz w:val="28"/>
+          <w:szCs w:val="28"/>
+        </w:rPr>
+        <w:t xml:space="preserve"> patch &lt;resource&gt; &lt;name&gt; \</w:t>
+      </w:r>
+    </w:p>
+    <w:p>
+      <w:pPr>
+        <w:spacing w:after="100"/>
+        <w:rPr>
+          <w:rFonts w:asciiTheme="majorBidi" w:hAnsiTheme="majorBidi" w:cstheme="majorBidi"/>
+          <w:sz w:val="28"/>
+          <w:szCs w:val="28"/>
+        </w:rPr>
+      </w:pPr>
+      <w:r>
+        <w:rPr>
+          <w:rFonts w:asciiTheme="majorBidi" w:hAnsiTheme="majorBidi" w:cstheme="majorBidi"/>
+          <w:sz w:val="28"/>
+          <w:szCs w:val="28"/>
+        </w:rPr>
+        <w:t xml:space="preserve">  --type=</w:t>
+      </w:r>
+      <w:proofErr w:type="spellStart"/>
+      <w:r>
+        <w:rPr>
+          <w:rFonts w:asciiTheme="majorBidi" w:hAnsiTheme="majorBidi" w:cstheme="majorBidi"/>
+          <w:sz w:val="28"/>
+          <w:szCs w:val="28"/>
+        </w:rPr>
+        <w:t>json</w:t>
+      </w:r>
+      <w:proofErr w:type="spellEnd"/>
+      <w:r>
+        <w:rPr>
+          <w:rFonts w:asciiTheme="majorBidi" w:hAnsiTheme="majorBidi" w:cstheme="majorBidi"/>
+          <w:sz w:val="28"/>
+          <w:szCs w:val="28"/>
+        </w:rPr>
+        <w:t xml:space="preserve"> \</w:t>
+      </w:r>
+    </w:p>
+    <w:p>
+      <w:pPr>
+        <w:spacing w:after="100"/>
+        <w:rPr>
+          <w:rFonts w:asciiTheme="majorBidi" w:hAnsiTheme="majorBidi" w:cstheme="majorBidi"/>
+          <w:sz w:val="28"/>
+          <w:szCs w:val="28"/>
+        </w:rPr>
+      </w:pPr>
+      <w:r>
+        <w:rPr>
+          <w:rFonts w:asciiTheme="majorBidi" w:hAnsiTheme="majorBidi" w:cstheme="majorBidi"/>
+          <w:sz w:val="28"/>
+          <w:szCs w:val="28"/>
+        </w:rPr>
+        <w:t xml:space="preserve">  -p='[{"</w:t>
+      </w:r>
+      <w:proofErr w:type="spellStart"/>
+      <w:r>
+        <w:rPr>
+          <w:rFonts w:asciiTheme="majorBidi" w:hAnsiTheme="majorBidi" w:cstheme="majorBidi"/>
+          <w:sz w:val="28"/>
+          <w:szCs w:val="28"/>
+        </w:rPr>
+        <w:t>op":"remove","path</w:t>
+      </w:r>
+      <w:proofErr w:type="spellEnd"/>
+      <w:r>
+        <w:rPr>
+          <w:rFonts w:asciiTheme="majorBidi" w:hAnsiTheme="majorBidi" w:cstheme="majorBidi"/>
+          <w:sz w:val="28"/>
+          <w:szCs w:val="28"/>
+        </w:rPr>
+        <w:t>":"/metadata/finalizers"}]'</w:t>
+      </w:r>
+    </w:p>
+    <w:p>
+      <w:pPr>
+        <w:spacing w:after="100"/>
+        <w:rPr>
+          <w:rFonts w:asciiTheme="majorBidi" w:hAnsiTheme="majorBidi" w:cstheme="majorBidi"/>
+          <w:sz w:val="28"/>
+          <w:szCs w:val="28"/>
+        </w:rPr>
+      </w:pPr>
+    </w:p>
+    <w:p>
+      <w:pPr>
+        <w:spacing w:after="100"/>
+        <w:rPr>
+          <w:rFonts w:asciiTheme="majorBidi" w:hAnsiTheme="majorBidi" w:cstheme="majorBidi"/>
+          <w:sz w:val="28"/>
+          <w:szCs w:val="28"/>
+        </w:rPr>
+      </w:pPr>
+      <w:r>
+        <w:rPr>
+          <w:rFonts w:asciiTheme="majorBidi" w:hAnsiTheme="majorBidi" w:cstheme="majorBidi"/>
+          <w:sz w:val="28"/>
+          <w:szCs w:val="28"/>
+        </w:rPr>
+        <w:t>The important distinction is:</w:t>
+      </w:r>
+    </w:p>
+    <w:p>
+      <w:pPr>
+        <w:spacing w:after="100"/>
+        <w:rPr>
+          <w:rFonts w:asciiTheme="majorBidi" w:hAnsiTheme="majorBidi" w:cstheme="majorBidi"/>
+          <w:sz w:val="28"/>
+          <w:szCs w:val="28"/>
+        </w:rPr>
+      </w:pPr>
+    </w:p>
+    <w:p>
+      <w:pPr>
+        <w:spacing w:after="100"/>
+        <w:rPr>
+          <w:rFonts w:asciiTheme="majorBidi" w:hAnsiTheme="majorBidi" w:cstheme="majorBidi"/>
+          <w:sz w:val="28"/>
+          <w:szCs w:val="28"/>
+        </w:rPr>
+      </w:pPr>
+      <w:proofErr w:type="spellStart"/>
+      <w:r>
+        <w:rPr>
+          <w:rFonts w:asciiTheme="majorBidi" w:hAnsiTheme="majorBidi" w:cstheme="majorBidi"/>
+          <w:sz w:val="28"/>
+          <w:szCs w:val="28"/>
+        </w:rPr>
+        <w:lastRenderedPageBreak/>
+        <w:t>kubectl</w:t>
+      </w:r>
+      <w:proofErr w:type="spellEnd"/>
+      <w:r>
+        <w:rPr>
+          <w:rFonts w:asciiTheme="majorBidi" w:hAnsiTheme="majorBidi" w:cstheme="majorBidi"/>
+          <w:sz w:val="28"/>
+          <w:szCs w:val="28"/>
+        </w:rPr>
+        <w:t xml:space="preserve"> apply</w:t>
+      </w:r>
+    </w:p>
+    <w:p>
+      <w:pPr>
+        <w:spacing w:after="100"/>
+        <w:rPr>
+          <w:rFonts w:asciiTheme="majorBidi" w:hAnsiTheme="majorBidi" w:cstheme="majorBidi"/>
+          <w:sz w:val="28"/>
+          <w:szCs w:val="28"/>
+        </w:rPr>
+      </w:pPr>
+      <w:r>
+        <w:rPr>
+          <w:rFonts w:asciiTheme="majorBidi" w:hAnsiTheme="majorBidi" w:cstheme="majorBidi"/>
+          <w:sz w:val="28"/>
+          <w:szCs w:val="28"/>
+        </w:rPr>
+        <w:t xml:space="preserve">    → declaratively create/update an object from a configuration</w:t>
+      </w:r>
+    </w:p>
+    <w:p>
+      <w:pPr>
+        <w:spacing w:after="100"/>
+        <w:rPr>
+          <w:rFonts w:asciiTheme="majorBidi" w:hAnsiTheme="majorBidi" w:cstheme="majorBidi"/>
+          <w:sz w:val="28"/>
+          <w:szCs w:val="28"/>
+        </w:rPr>
+      </w:pPr>
+    </w:p>
+    <w:p>
+      <w:pPr>
+        <w:spacing w:after="100"/>
+        <w:rPr>
+          <w:rFonts w:asciiTheme="majorBidi" w:hAnsiTheme="majorBidi" w:cstheme="majorBidi"/>
+          <w:sz w:val="28"/>
+          <w:szCs w:val="28"/>
+        </w:rPr>
+      </w:pPr>
+      <w:proofErr w:type="spellStart"/>
+      <w:r>
+        <w:rPr>
+          <w:rFonts w:asciiTheme="majorBidi" w:hAnsiTheme="majorBidi" w:cstheme="majorBidi"/>
+          <w:sz w:val="28"/>
+          <w:szCs w:val="28"/>
+        </w:rPr>
+        <w:t>kubectl</w:t>
+      </w:r>
+      <w:proofErr w:type="spellEnd"/>
+      <w:r>
+        <w:rPr>
+          <w:rFonts w:asciiTheme="majorBidi" w:hAnsiTheme="majorBidi" w:cstheme="majorBidi"/>
+          <w:sz w:val="28"/>
+          <w:szCs w:val="28"/>
+        </w:rPr>
+        <w:t xml:space="preserve"> edit</w:t>
+      </w:r>
+    </w:p>
+    <w:p>
+      <w:pPr>
+        <w:spacing w:after="100"/>
+        <w:rPr>
+          <w:rFonts w:asciiTheme="majorBidi" w:hAnsiTheme="majorBidi" w:cstheme="majorBidi"/>
+          <w:sz w:val="28"/>
+          <w:szCs w:val="28"/>
+        </w:rPr>
+      </w:pPr>
+      <w:r>
+        <w:rPr>
+          <w:rFonts w:asciiTheme="majorBidi" w:hAnsiTheme="majorBidi" w:cstheme="majorBidi"/>
+          <w:sz w:val="28"/>
+          <w:szCs w:val="28"/>
+        </w:rPr>
+        <w:t xml:space="preserve">    → interactively edit the object</w:t>
+      </w:r>
+    </w:p>
+    <w:p>
+      <w:pPr>
+        <w:spacing w:after="100"/>
+        <w:rPr>
+          <w:rFonts w:asciiTheme="majorBidi" w:hAnsiTheme="majorBidi" w:cstheme="majorBidi"/>
+          <w:sz w:val="28"/>
+          <w:szCs w:val="28"/>
+        </w:rPr>
+      </w:pPr>
+    </w:p>
+    <w:p>
+      <w:pPr>
+        <w:spacing w:after="100"/>
+        <w:rPr>
+          <w:rFonts w:asciiTheme="majorBidi" w:hAnsiTheme="majorBidi" w:cstheme="majorBidi"/>
+          <w:sz w:val="28"/>
+          <w:szCs w:val="28"/>
+        </w:rPr>
+      </w:pPr>
+      <w:proofErr w:type="spellStart"/>
+      <w:r>
+        <w:rPr>
+          <w:rFonts w:asciiTheme="majorBidi" w:hAnsiTheme="majorBidi" w:cstheme="majorBidi"/>
+          <w:sz w:val="28"/>
+          <w:szCs w:val="28"/>
+        </w:rPr>
+        <w:t>kubectl</w:t>
+      </w:r>
+      <w:proofErr w:type="spellEnd"/>
+      <w:r>
+        <w:rPr>
+          <w:rFonts w:asciiTheme="majorBidi" w:hAnsiTheme="majorBidi" w:cstheme="majorBidi"/>
+          <w:sz w:val="28"/>
+          <w:szCs w:val="28"/>
+        </w:rPr>
+        <w:t xml:space="preserve"> patch</w:t>
+      </w:r>
+    </w:p>
+    <w:p>
+      <w:pPr>
+        <w:spacing w:after="100"/>
+        <w:rPr>
+          <w:rFonts w:asciiTheme="majorBidi" w:hAnsiTheme="majorBidi" w:cstheme="majorBidi"/>
+          <w:sz w:val="28"/>
+          <w:szCs w:val="28"/>
+        </w:rPr>
+      </w:pPr>
+      <w:r>
+        <w:rPr>
+          <w:rFonts w:asciiTheme="majorBidi" w:hAnsiTheme="majorBidi" w:cstheme="majorBidi"/>
+          <w:sz w:val="28"/>
+          <w:szCs w:val="28"/>
+        </w:rPr>
+        <w:t xml:space="preserve">    → modify specific fields of an existing object</w:t>
+      </w:r>
+    </w:p>
+    <w:p>
+      <w:pPr>
+        <w:spacing w:after="100"/>
+        <w:rPr>
+          <w:rFonts w:asciiTheme="majorBidi" w:hAnsiTheme="majorBidi" w:cstheme="majorBidi"/>
+          <w:sz w:val="28"/>
+          <w:szCs w:val="28"/>
+        </w:rPr>
+      </w:pPr>
+    </w:p>
+    <w:p>
+      <w:pPr>
+        <w:spacing w:after="100"/>
+        <w:jc w:val="both"/>
+        <w:rPr>
+          <w:rFonts w:asciiTheme="majorBidi" w:hAnsiTheme="majorBidi" w:cstheme="majorBidi"/>
+          <w:sz w:val="28"/>
+          <w:szCs w:val="28"/>
+        </w:rPr>
+      </w:pPr>
+      <w:proofErr w:type="spellStart"/>
+      <w:r>
+        <w:rPr>
+          <w:rFonts w:asciiTheme="majorBidi" w:hAnsiTheme="majorBidi" w:cstheme="majorBidi"/>
+          <w:sz w:val="28"/>
+          <w:szCs w:val="28"/>
+        </w:rPr>
+        <w:t>kubectl</w:t>
+      </w:r>
+      <w:proofErr w:type="spellEnd"/>
+      <w:r>
+        <w:rPr>
+          <w:rFonts w:asciiTheme="majorBidi" w:hAnsiTheme="majorBidi" w:cstheme="majorBidi"/>
+          <w:sz w:val="28"/>
+          <w:szCs w:val="28"/>
+        </w:rPr>
+        <w:t xml:space="preserve"> patch is especially useful for targeted operational changes and troubleshooting, where replacing or manually editing the entire object would be unnecessary or undesirable.</w:t>
+      </w:r>
+    </w:p>
+    <w:p>
+      <w:pPr>
+        <w:spacing w:after="100"/>
+        <w:jc w:val="both"/>
+        <w:rPr>
+          <w:rFonts w:asciiTheme="majorBidi" w:hAnsiTheme="majorBidi" w:cstheme="majorBidi"/>
+          <w:sz w:val="28"/>
+          <w:szCs w:val="28"/>
+        </w:rPr>
+      </w:pPr>
+    </w:p>
+    <w:p>
+      <w:pPr>
+        <w:spacing w:after="100"/>
+        <w:jc w:val="both"/>
+        <w:rPr>
+          <w:rFonts w:asciiTheme="majorBidi" w:hAnsiTheme="majorBidi" w:cstheme="majorBidi"/>
+          <w:sz w:val="28"/>
+          <w:szCs w:val="28"/>
+        </w:rPr>
+      </w:pPr>
+    </w:p>
+    <w:p>
+      <w:pPr>
+        <w:spacing w:after="100"/>
+        <w:jc w:val="both"/>
+        <w:rPr>
+          <w:rFonts w:asciiTheme="majorBidi" w:hAnsiTheme="majorBidi" w:cstheme="majorBidi"/>
+          <w:sz w:val="28"/>
+          <w:szCs w:val="28"/>
+        </w:rPr>
+      </w:pPr>
+    </w:p>
+    <w:p>
+      <w:pPr>
         <w:spacing w:after="80"/>
         <w:jc w:val="both"/>
         <w:rPr>
@@ -10828,7 +11699,6 @@
           <w:sz w:val="28"/>
           <w:szCs w:val="28"/>
         </w:rPr>
-        <w:lastRenderedPageBreak/>
         <w:t>kubectl</w:t>
       </w:r>
       <w:proofErr w:type="spellEnd"/>
@@ -11040,6 +11910,7 @@
           <w:sz w:val="28"/>
           <w:szCs w:val="28"/>
         </w:rPr>
+        <w:lastRenderedPageBreak/>
         <w:t>kubectl</w:t>
       </w:r>
       <w:proofErr w:type="spellEnd"/>
@@ -12145,6 +13016,7 @@
           <w:szCs w:val="28"/>
           <w:highlight w:val="cyan"/>
         </w:rPr>
+        <w:lastRenderedPageBreak/>
         <w:t>kubectl</w:t>
       </w:r>
       <w:proofErr w:type="spellEnd"/>

</xml_diff>